<commit_message>
RM: change acceptance test Upload_Query_FASTA_File_For_BLASTP to match current lay out
</commit_message>
<xml_diff>
--- a/BlastImplementation/documentation/Use case diagram/acceptance_tests/Upload_Query_FASTA_File_For_BLASTP.docx
+++ b/BlastImplementation/documentation/Use case diagram/acceptance_tests/Upload_Query_FASTA_File_For_BLASTP.docx
@@ -176,6 +176,7 @@
       </w:pPr>
       <w:r>
         <w:rPr>
+          <w:noProof/>
           <w:sz w:val="32"/>
           <w:szCs w:val="32"/>
         </w:rPr>
@@ -223,11 +224,52 @@
           <w:szCs w:val="32"/>
         </w:rPr>
       </w:pPr>
-      <w:r>
-        <w:rPr>
-          <w:sz w:val="32"/>
-          <w:szCs w:val="32"/>
-        </w:rPr>
+    </w:p>
+    <w:p>
+      <w:pPr>
+        <w:rPr>
+          <w:sz w:val="32"/>
+          <w:szCs w:val="32"/>
+        </w:rPr>
+      </w:pPr>
+    </w:p>
+    <w:p>
+      <w:pPr>
+        <w:rPr>
+          <w:sz w:val="32"/>
+          <w:szCs w:val="32"/>
+        </w:rPr>
+      </w:pPr>
+    </w:p>
+    <w:p>
+      <w:pPr>
+        <w:rPr>
+          <w:sz w:val="32"/>
+          <w:szCs w:val="32"/>
+        </w:rPr>
+      </w:pPr>
+    </w:p>
+    <w:p>
+      <w:pPr>
+        <w:rPr>
+          <w:sz w:val="32"/>
+          <w:szCs w:val="32"/>
+        </w:rPr>
+      </w:pPr>
+    </w:p>
+    <w:p>
+      <w:pPr>
+        <w:rPr>
+          <w:sz w:val="32"/>
+          <w:szCs w:val="32"/>
+        </w:rPr>
+      </w:pPr>
+      <w:r>
+        <w:rPr>
+          <w:sz w:val="32"/>
+          <w:szCs w:val="32"/>
+        </w:rPr>
+        <w:lastRenderedPageBreak/>
         <w:t>Step 2: Open the application</w:t>
       </w:r>
       <w:r>
@@ -250,12 +292,11 @@
           <w:sz w:val="32"/>
           <w:szCs w:val="32"/>
         </w:rPr>
-        <w:lastRenderedPageBreak/>
         <w:drawing>
-          <wp:inline distT="0" distB="0" distL="0" distR="0" wp14:anchorId="1B60DF6E" wp14:editId="49ABFE40">
-            <wp:extent cx="5760720" cy="4158615"/>
-            <wp:effectExtent l="0" t="0" r="0" b="0"/>
-            <wp:docPr id="216020880" name="Picture 1"/>
+          <wp:inline distT="0" distB="0" distL="0" distR="0" wp14:anchorId="55C1877F" wp14:editId="2093FCAD">
+            <wp:extent cx="5760720" cy="4203700"/>
+            <wp:effectExtent l="0" t="0" r="0" b="6350"/>
+            <wp:docPr id="453600147" name="Picture 1"/>
             <wp:cNvGraphicFramePr>
               <a:graphicFrameLocks xmlns:a="http://schemas.openxmlformats.org/drawingml/2006/main" noChangeAspect="1"/>
             </wp:cNvGraphicFramePr>
@@ -263,7 +304,7 @@
               <a:graphicData uri="http://schemas.openxmlformats.org/drawingml/2006/picture">
                 <pic:pic xmlns:pic="http://schemas.openxmlformats.org/drawingml/2006/picture">
                   <pic:nvPicPr>
-                    <pic:cNvPr id="216020880" name=""/>
+                    <pic:cNvPr id="453600147" name=""/>
                     <pic:cNvPicPr/>
                   </pic:nvPicPr>
                   <pic:blipFill>
@@ -275,7 +316,7 @@
                   <pic:spPr>
                     <a:xfrm>
                       <a:off x="0" y="0"/>
-                      <a:ext cx="5760720" cy="4158615"/>
+                      <a:ext cx="5760720" cy="4203700"/>
                     </a:xfrm>
                     <a:prstGeom prst="rect">
                       <a:avLst/>
@@ -323,10 +364,10 @@
           <w:szCs w:val="32"/>
         </w:rPr>
         <w:drawing>
-          <wp:inline distT="0" distB="0" distL="0" distR="0" wp14:anchorId="224D7FE5" wp14:editId="279CD48B">
-            <wp:extent cx="5760720" cy="4169410"/>
-            <wp:effectExtent l="0" t="0" r="0" b="2540"/>
-            <wp:docPr id="1938017655" name="Picture 1"/>
+          <wp:inline distT="0" distB="0" distL="0" distR="0" wp14:anchorId="07DB7DA5" wp14:editId="725F8AF8">
+            <wp:extent cx="5029481" cy="3616325"/>
+            <wp:effectExtent l="0" t="0" r="0" b="3175"/>
+            <wp:docPr id="928179729" name="Picture 1"/>
             <wp:cNvGraphicFramePr>
               <a:graphicFrameLocks xmlns:a="http://schemas.openxmlformats.org/drawingml/2006/main" noChangeAspect="1"/>
             </wp:cNvGraphicFramePr>
@@ -334,7 +375,7 @@
               <a:graphicData uri="http://schemas.openxmlformats.org/drawingml/2006/picture">
                 <pic:pic xmlns:pic="http://schemas.openxmlformats.org/drawingml/2006/picture">
                   <pic:nvPicPr>
-                    <pic:cNvPr id="1938017655" name=""/>
+                    <pic:cNvPr id="928179729" name=""/>
                     <pic:cNvPicPr/>
                   </pic:nvPicPr>
                   <pic:blipFill>
@@ -346,7 +387,7 @@
                   <pic:spPr>
                     <a:xfrm>
                       <a:off x="0" y="0"/>
-                      <a:ext cx="5760720" cy="4169410"/>
+                      <a:ext cx="5039911" cy="3623824"/>
                     </a:xfrm>
                     <a:prstGeom prst="rect">
                       <a:avLst/>
@@ -395,10 +436,10 @@
           <w:szCs w:val="32"/>
         </w:rPr>
         <w:drawing>
-          <wp:inline distT="0" distB="0" distL="0" distR="0" wp14:anchorId="47251C91" wp14:editId="059B8E7D">
-            <wp:extent cx="5760720" cy="4137660"/>
+          <wp:inline distT="0" distB="0" distL="0" distR="0" wp14:anchorId="6164B3F1" wp14:editId="34AACCDC">
+            <wp:extent cx="5760720" cy="4156075"/>
             <wp:effectExtent l="0" t="0" r="0" b="0"/>
-            <wp:docPr id="1073438437" name="Picture 1"/>
+            <wp:docPr id="2103202046" name="Picture 1"/>
             <wp:cNvGraphicFramePr>
               <a:graphicFrameLocks xmlns:a="http://schemas.openxmlformats.org/drawingml/2006/main" noChangeAspect="1"/>
             </wp:cNvGraphicFramePr>
@@ -406,7 +447,7 @@
               <a:graphicData uri="http://schemas.openxmlformats.org/drawingml/2006/picture">
                 <pic:pic xmlns:pic="http://schemas.openxmlformats.org/drawingml/2006/picture">
                   <pic:nvPicPr>
-                    <pic:cNvPr id="1073438437" name=""/>
+                    <pic:cNvPr id="2103202046" name=""/>
                     <pic:cNvPicPr/>
                   </pic:nvPicPr>
                   <pic:blipFill>
@@ -418,7 +459,7 @@
                   <pic:spPr>
                     <a:xfrm>
                       <a:off x="0" y="0"/>
-                      <a:ext cx="5760720" cy="4137660"/>
+                      <a:ext cx="5760720" cy="4156075"/>
                     </a:xfrm>
                     <a:prstGeom prst="rect">
                       <a:avLst/>
@@ -466,10 +507,10 @@
           <w:szCs w:val="32"/>
         </w:rPr>
         <w:drawing>
-          <wp:inline distT="0" distB="0" distL="0" distR="0" wp14:anchorId="3D65C59C" wp14:editId="50429F08">
-            <wp:extent cx="4486759" cy="3573780"/>
-            <wp:effectExtent l="0" t="0" r="9525" b="7620"/>
-            <wp:docPr id="1150345026" name="Picture 1"/>
+          <wp:inline distT="0" distB="0" distL="0" distR="0" wp14:anchorId="69E5803A" wp14:editId="04448372">
+            <wp:extent cx="4876800" cy="3496330"/>
+            <wp:effectExtent l="0" t="0" r="0" b="8890"/>
+            <wp:docPr id="168370586" name="Picture 1"/>
             <wp:cNvGraphicFramePr>
               <a:graphicFrameLocks xmlns:a="http://schemas.openxmlformats.org/drawingml/2006/main" noChangeAspect="1"/>
             </wp:cNvGraphicFramePr>
@@ -477,7 +518,7 @@
               <a:graphicData uri="http://schemas.openxmlformats.org/drawingml/2006/picture">
                 <pic:pic xmlns:pic="http://schemas.openxmlformats.org/drawingml/2006/picture">
                   <pic:nvPicPr>
-                    <pic:cNvPr id="1150345026" name=""/>
+                    <pic:cNvPr id="168370586" name=""/>
                     <pic:cNvPicPr/>
                   </pic:nvPicPr>
                   <pic:blipFill>
@@ -489,7 +530,7 @@
                   <pic:spPr>
                     <a:xfrm>
                       <a:off x="0" y="0"/>
-                      <a:ext cx="4511176" cy="3593228"/>
+                      <a:ext cx="4878386" cy="3497467"/>
                     </a:xfrm>
                     <a:prstGeom prst="rect">
                       <a:avLst/>
@@ -538,10 +579,10 @@
           <w:szCs w:val="32"/>
         </w:rPr>
         <w:drawing>
-          <wp:inline distT="0" distB="0" distL="0" distR="0" wp14:anchorId="37D387CD" wp14:editId="768665EA">
-            <wp:extent cx="5760720" cy="4122420"/>
-            <wp:effectExtent l="0" t="0" r="0" b="0"/>
-            <wp:docPr id="1555102291" name="Picture 1"/>
+          <wp:inline distT="0" distB="0" distL="0" distR="0" wp14:anchorId="4E7291D9" wp14:editId="178F8007">
+            <wp:extent cx="5760720" cy="4151630"/>
+            <wp:effectExtent l="0" t="0" r="0" b="1270"/>
+            <wp:docPr id="145418581" name="Picture 1"/>
             <wp:cNvGraphicFramePr>
               <a:graphicFrameLocks xmlns:a="http://schemas.openxmlformats.org/drawingml/2006/main" noChangeAspect="1"/>
             </wp:cNvGraphicFramePr>
@@ -549,7 +590,7 @@
               <a:graphicData uri="http://schemas.openxmlformats.org/drawingml/2006/picture">
                 <pic:pic xmlns:pic="http://schemas.openxmlformats.org/drawingml/2006/picture">
                   <pic:nvPicPr>
-                    <pic:cNvPr id="1555102291" name=""/>
+                    <pic:cNvPr id="145418581" name=""/>
                     <pic:cNvPicPr/>
                   </pic:nvPicPr>
                   <pic:blipFill>
@@ -561,7 +602,7 @@
                   <pic:spPr>
                     <a:xfrm>
                       <a:off x="0" y="0"/>
-                      <a:ext cx="5760720" cy="4122420"/>
+                      <a:ext cx="5760720" cy="4151630"/>
                     </a:xfrm>
                     <a:prstGeom prst="rect">
                       <a:avLst/>
@@ -1361,6 +1402,7 @@
   <w:style w:type="character" w:default="1" w:styleId="DefaultParagraphFont">
     <w:name w:val="Default Paragraph Font"/>
     <w:uiPriority w:val="1"/>
+    <w:semiHidden/>
     <w:unhideWhenUsed/>
   </w:style>
   <w:style w:type="table" w:default="1" w:styleId="TableNormal">

</xml_diff>